<commit_message>
The version 1 commit phase 2
</commit_message>
<xml_diff>
--- a/docs/PLUGIN_SRS.docx
+++ b/docs/PLUGIN_SRS.docx
@@ -233,16 +233,7 @@
         <w:pStyle w:val="Title"/>
       </w:pPr>
       <w:r>
-        <w:rPr>
-          <w:color w:val="173052"/>
-        </w:rPr>
-        <w:t>EV Charging Station Management </w:t>
-      </w:r>
-      <w:r>
-        <w:rPr>
-          <w:color w:val="173052"/>
-        </w:rPr>
-        <w:t>System</w:t>
+        <w:t>EV Charging Network Renewable-Optimization Platform</w:t>
       </w:r>
     </w:p>
     <w:p>
@@ -1145,96 +1136,8 @@
             <w:tcW w:w="4876" w:type="dxa"/>
           </w:tcPr>
           <w:p>
-            <w:pPr>
-              <w:pStyle w:val="TableParagraph"/>
-              <w:spacing w:before="79"/>
-              <w:ind w:left="101"/>
-              <w:rPr>
-                <w:sz w:val="21"/>
-              </w:rPr>
-            </w:pPr>
-            <w:r>
-              <w:rPr>
-                <w:color w:val="212121"/>
-                <w:sz w:val="21"/>
-              </w:rPr>
-              <w:t>Web-based</w:t>
-            </w:r>
-            <w:r>
-              <w:rPr>
-                <w:color w:val="212121"/>
-                <w:spacing w:val="-5"/>
-                <w:sz w:val="21"/>
-              </w:rPr>
-              <w:t> </w:t>
-            </w:r>
-            <w:r>
-              <w:rPr>
-                <w:color w:val="212121"/>
-                <w:sz w:val="21"/>
-              </w:rPr>
-              <w:t>EV</w:t>
-            </w:r>
-            <w:r>
-              <w:rPr>
-                <w:color w:val="212121"/>
-                <w:spacing w:val="-5"/>
-                <w:sz w:val="21"/>
-              </w:rPr>
-              <w:t> </w:t>
-            </w:r>
-            <w:r>
-              <w:rPr>
-                <w:color w:val="212121"/>
-                <w:sz w:val="21"/>
-              </w:rPr>
-              <w:t>charging</w:t>
-            </w:r>
-            <w:r>
-              <w:rPr>
-                <w:color w:val="212121"/>
-                <w:spacing w:val="-4"/>
-                <w:sz w:val="21"/>
-              </w:rPr>
-              <w:t> </w:t>
-            </w:r>
-            <w:r>
-              <w:rPr>
-                <w:color w:val="212121"/>
-                <w:sz w:val="21"/>
-              </w:rPr>
-              <w:t>station</w:t>
-            </w:r>
-            <w:r>
-              <w:rPr>
-                <w:color w:val="212121"/>
-                <w:spacing w:val="-5"/>
-                <w:sz w:val="21"/>
-              </w:rPr>
-              <w:t> </w:t>
-            </w:r>
-            <w:r>
-              <w:rPr>
-                <w:color w:val="212121"/>
-                <w:sz w:val="21"/>
-              </w:rPr>
-              <w:t>management</w:t>
-            </w:r>
-            <w:r>
-              <w:rPr>
-                <w:color w:val="212121"/>
-                <w:spacing w:val="-5"/>
-                <w:sz w:val="21"/>
-              </w:rPr>
-              <w:t> </w:t>
-            </w:r>
-            <w:r>
-              <w:rPr>
-                <w:color w:val="212121"/>
-                <w:spacing w:val="-2"/>
-                <w:sz w:val="21"/>
-              </w:rPr>
-              <w:t>platform</w:t>
+            <w:r>
+              <w:t>Web and mobile renewable-aware EV charging platform</w:t>
             </w:r>
           </w:p>
         </w:tc>
@@ -1274,21 +1177,8 @@
             <w:tcW w:w="4876" w:type="dxa"/>
           </w:tcPr>
           <w:p>
-            <w:pPr>
-              <w:pStyle w:val="TableParagraph"/>
-              <w:spacing w:before="78"/>
-              <w:ind w:left="101"/>
-              <w:rPr>
-                <w:sz w:val="21"/>
-              </w:rPr>
-            </w:pPr>
-            <w:r>
-              <w:rPr>
-                <w:color w:val="212121"/>
-                <w:spacing w:val="-5"/>
-                <w:sz w:val="21"/>
-              </w:rPr>
-              <w:t>1.0</w:t>
+            <w:r>
+              <w:t>1.1</w:t>
             </w:r>
           </w:p>
         </w:tc>
@@ -1337,42 +1227,7 @@
               </w:rPr>
             </w:pPr>
             <w:r>
-              <w:rPr>
-                <w:color w:val="212121"/>
-                <w:sz w:val="21"/>
-              </w:rPr>
-              <w:t>1</w:t>
-            </w:r>
-            <w:r>
-              <w:rPr>
-                <w:color w:val="212121"/>
-                <w:spacing w:val="-2"/>
-                <w:sz w:val="21"/>
-              </w:rPr>
-              <w:t> </w:t>
-            </w:r>
-            <w:r>
-              <w:rPr>
-                <w:color w:val="212121"/>
-                <w:sz w:val="21"/>
-              </w:rPr>
-              <w:t>April</w:t>
-            </w:r>
-            <w:r>
-              <w:rPr>
-                <w:color w:val="212121"/>
-                <w:spacing w:val="-2"/>
-                <w:sz w:val="21"/>
-              </w:rPr>
-              <w:t> </w:t>
-            </w:r>
-            <w:r>
-              <w:rPr>
-                <w:color w:val="212121"/>
-                <w:spacing w:val="-4"/>
-                <w:sz w:val="21"/>
-              </w:rPr>
-              <w:t>2026</w:t>
+              <w:t>12 September 2026</w:t>
             </w:r>
           </w:p>
         </w:tc>
@@ -2245,24 +2100,8 @@
             <w:shd w:val="clear" w:color="auto" w:fill="0A3C39"/>
           </w:tcPr>
           <w:p>
-            <w:pPr>
-              <w:pStyle w:val="TableParagraph"/>
-              <w:spacing w:before="104"/>
-              <w:ind w:left="19"/>
-              <w:jc w:val="center"/>
-              <w:rPr>
-                <w:b/>
-                <w:sz w:val="20"/>
-              </w:rPr>
-            </w:pPr>
-            <w:r>
-              <w:rPr>
-                <w:b/>
-                <w:color w:val="FFFFFF"/>
-                <w:spacing w:val="-4"/>
-                <w:sz w:val="20"/>
-              </w:rPr>
-              <w:t>Date</w:t>
+            <w:r>
+              <w:t>1.1</w:t>
             </w:r>
           </w:p>
         </w:tc>
@@ -2388,34 +2227,7 @@
               </w:rPr>
             </w:pPr>
             <w:r>
-              <w:rPr>
-                <w:color w:val="212121"/>
-                <w:sz w:val="21"/>
-              </w:rPr>
-              <w:t>1</w:t>
-            </w:r>
-            <w:r>
-              <w:rPr>
-                <w:color w:val="212121"/>
-                <w:spacing w:val="-2"/>
-                <w:sz w:val="21"/>
-              </w:rPr>
-              <w:t> </w:t>
-            </w:r>
-            <w:r>
-              <w:rPr>
-                <w:color w:val="212121"/>
-                <w:sz w:val="21"/>
-              </w:rPr>
-              <w:t>Apr </w:t>
-            </w:r>
-            <w:r>
-              <w:rPr>
-                <w:color w:val="212121"/>
-                <w:spacing w:val="-4"/>
-                <w:sz w:val="21"/>
-              </w:rPr>
-              <w:t>2026</w:t>
+              <w:t>12 Sep 2026</w:t>
             </w:r>
           </w:p>
         </w:tc>
@@ -2499,6 +2311,48 @@
                 <w:sz w:val="21"/>
               </w:rPr>
               <w:t>documentation</w:t>
+            </w:r>
+          </w:p>
+        </w:tc>
+      </w:tr>
+      <w:tr>
+        <w:tc>
+          <w:tcPr>
+            <w:tcW w:type="dxa" w:w="2438"/>
+          </w:tcPr>
+          <w:p>
+            <w:r>
+              <w:t>1.1</w:t>
+            </w:r>
+          </w:p>
+        </w:tc>
+        <w:tc>
+          <w:tcPr>
+            <w:tcW w:type="dxa" w:w="2438"/>
+          </w:tcPr>
+          <w:p>
+            <w:r>
+              <w:t>12 Sep 2026</w:t>
+            </w:r>
+          </w:p>
+        </w:tc>
+        <w:tc>
+          <w:tcPr>
+            <w:tcW w:type="dxa" w:w="2438"/>
+          </w:tcPr>
+          <w:p>
+            <w:r>
+              <w:t>Renewable intelligence and MongoDB alignment</w:t>
+            </w:r>
+          </w:p>
+        </w:tc>
+        <w:tc>
+          <w:tcPr>
+            <w:tcW w:type="dxa" w:w="2438"/>
+          </w:tcPr>
+          <w:p>
+            <w:r>
+              <w:t>Project documentation</w:t>
             </w:r>
           </w:p>
         </w:tc>
@@ -3328,192 +3182,7 @@
         <w:ind w:left="143"/>
       </w:pPr>
       <w:r>
-        <w:rPr>
-          <w:color w:val="212121"/>
-        </w:rPr>
-        <w:t>PLUGIN</w:t>
-      </w:r>
-      <w:r>
-        <w:rPr>
-          <w:color w:val="212121"/>
-          <w:spacing w:val="-5"/>
-        </w:rPr>
-        <w:t> </w:t>
-      </w:r>
-      <w:r>
-        <w:rPr>
-          <w:color w:val="212121"/>
-        </w:rPr>
-        <w:t>is</w:t>
-      </w:r>
-      <w:r>
-        <w:rPr>
-          <w:color w:val="212121"/>
-          <w:spacing w:val="-5"/>
-        </w:rPr>
-        <w:t> </w:t>
-      </w:r>
-      <w:r>
-        <w:rPr>
-          <w:color w:val="212121"/>
-        </w:rPr>
-        <w:t>a</w:t>
-      </w:r>
-      <w:r>
-        <w:rPr>
-          <w:color w:val="212121"/>
-          <w:spacing w:val="-5"/>
-        </w:rPr>
-        <w:t> </w:t>
-      </w:r>
-      <w:r>
-        <w:rPr>
-          <w:color w:val="212121"/>
-        </w:rPr>
-        <w:t>web-based</w:t>
-      </w:r>
-      <w:r>
-        <w:rPr>
-          <w:color w:val="212121"/>
-          <w:spacing w:val="-4"/>
-        </w:rPr>
-        <w:t> </w:t>
-      </w:r>
-      <w:r>
-        <w:rPr>
-          <w:color w:val="212121"/>
-        </w:rPr>
-        <w:t>EV</w:t>
-      </w:r>
-      <w:r>
-        <w:rPr>
-          <w:color w:val="212121"/>
-          <w:spacing w:val="-4"/>
-        </w:rPr>
-        <w:t> </w:t>
-      </w:r>
-      <w:r>
-        <w:rPr>
-          <w:color w:val="212121"/>
-        </w:rPr>
-        <w:t>charging</w:t>
-      </w:r>
-      <w:r>
-        <w:rPr>
-          <w:color w:val="212121"/>
-          <w:spacing w:val="-4"/>
-        </w:rPr>
-        <w:t> </w:t>
-      </w:r>
-      <w:r>
-        <w:rPr>
-          <w:color w:val="212121"/>
-        </w:rPr>
-        <w:t>station</w:t>
-      </w:r>
-      <w:r>
-        <w:rPr>
-          <w:color w:val="212121"/>
-          <w:spacing w:val="-4"/>
-        </w:rPr>
-        <w:t> </w:t>
-      </w:r>
-      <w:r>
-        <w:rPr>
-          <w:color w:val="212121"/>
-        </w:rPr>
-        <w:t>management</w:t>
-      </w:r>
-      <w:r>
-        <w:rPr>
-          <w:color w:val="212121"/>
-          <w:spacing w:val="-4"/>
-        </w:rPr>
-        <w:t> </w:t>
-      </w:r>
-      <w:r>
-        <w:rPr>
-          <w:color w:val="212121"/>
-        </w:rPr>
-        <w:t>platform</w:t>
-      </w:r>
-      <w:r>
-        <w:rPr>
-          <w:color w:val="212121"/>
-          <w:spacing w:val="-5"/>
-        </w:rPr>
-        <w:t> </w:t>
-      </w:r>
-      <w:r>
-        <w:rPr>
-          <w:color w:val="212121"/>
-        </w:rPr>
-        <w:t>designed</w:t>
-      </w:r>
-      <w:r>
-        <w:rPr>
-          <w:color w:val="212121"/>
-          <w:spacing w:val="-4"/>
-        </w:rPr>
-        <w:t> </w:t>
-      </w:r>
-      <w:r>
-        <w:rPr>
-          <w:color w:val="212121"/>
-        </w:rPr>
-        <w:t>to</w:t>
-      </w:r>
-      <w:r>
-        <w:rPr>
-          <w:color w:val="212121"/>
-          <w:spacing w:val="-5"/>
-        </w:rPr>
-        <w:t> </w:t>
-      </w:r>
-      <w:r>
-        <w:rPr>
-          <w:color w:val="212121"/>
-        </w:rPr>
-        <w:t>support</w:t>
-      </w:r>
-      <w:r>
-        <w:rPr>
-          <w:color w:val="212121"/>
-          <w:spacing w:val="-4"/>
-        </w:rPr>
-        <w:t> </w:t>
-      </w:r>
-      <w:r>
-        <w:rPr>
-          <w:color w:val="212121"/>
-        </w:rPr>
-        <w:t>customer</w:t>
-      </w:r>
-      <w:r>
-        <w:rPr>
-          <w:color w:val="212121"/>
-          <w:spacing w:val="-4"/>
-        </w:rPr>
-        <w:t> </w:t>
-      </w:r>
-      <w:r>
-        <w:rPr>
-          <w:color w:val="212121"/>
-        </w:rPr>
-        <w:t>booking</w:t>
-      </w:r>
-      <w:r>
-        <w:rPr>
-          <w:color w:val="212121"/>
-          <w:spacing w:val="-4"/>
-        </w:rPr>
-        <w:t> </w:t>
-      </w:r>
-      <w:r>
-        <w:rPr>
-          <w:color w:val="212121"/>
-        </w:rPr>
-        <w:t>journeys and operator-side station administration within a single controlled system. The platform combines station discovery, reservation handling, charging session lifecycle management, billing visibility, notifications, and role- based administration.</w:t>
+        <w:t>PLUGIN is a web and mobile EV charging management platform designed to support customer charging journeys, renewable-aware scheduling, and operator-side station and grid planning within a single controlled system. The platform combines station discovery, reservation handling, charging session lifecycle management, billing visibility, notifications, and role- based administration.</w:t>
       </w:r>
     </w:p>
     <w:p>
@@ -5807,87 +5476,7 @@
         </w:rPr>
       </w:pPr>
       <w:r>
-        <w:rPr>
-          <w:color w:val="212121"/>
-          <w:sz w:val="21"/>
-        </w:rPr>
-        <w:t>Native</w:t>
-      </w:r>
-      <w:r>
-        <w:rPr>
-          <w:color w:val="212121"/>
-          <w:spacing w:val="-6"/>
-          <w:sz w:val="21"/>
-        </w:rPr>
-        <w:t> </w:t>
-      </w:r>
-      <w:r>
-        <w:rPr>
-          <w:color w:val="212121"/>
-          <w:sz w:val="21"/>
-        </w:rPr>
-        <w:t>mobile</w:t>
-      </w:r>
-      <w:r>
-        <w:rPr>
-          <w:color w:val="212121"/>
-          <w:spacing w:val="-5"/>
-          <w:sz w:val="21"/>
-        </w:rPr>
-        <w:t> </w:t>
-      </w:r>
-      <w:r>
-        <w:rPr>
-          <w:color w:val="212121"/>
-          <w:sz w:val="21"/>
-        </w:rPr>
-        <w:t>applications</w:t>
-      </w:r>
-      <w:r>
-        <w:rPr>
-          <w:color w:val="212121"/>
-          <w:spacing w:val="-5"/>
-          <w:sz w:val="21"/>
-        </w:rPr>
-        <w:t> </w:t>
-      </w:r>
-      <w:r>
-        <w:rPr>
-          <w:color w:val="212121"/>
-          <w:sz w:val="21"/>
-        </w:rPr>
-        <w:t>as</w:t>
-      </w:r>
-      <w:r>
-        <w:rPr>
-          <w:color w:val="212121"/>
-          <w:spacing w:val="-5"/>
-          <w:sz w:val="21"/>
-        </w:rPr>
-        <w:t> </w:t>
-      </w:r>
-      <w:r>
-        <w:rPr>
-          <w:color w:val="212121"/>
-          <w:sz w:val="21"/>
-        </w:rPr>
-        <w:t>separate</w:t>
-      </w:r>
-      <w:r>
-        <w:rPr>
-          <w:color w:val="212121"/>
-          <w:spacing w:val="-5"/>
-          <w:sz w:val="21"/>
-        </w:rPr>
-        <w:t> </w:t>
-      </w:r>
-      <w:r>
-        <w:rPr>
-          <w:color w:val="212121"/>
-          <w:spacing w:val="-2"/>
-          <w:sz w:val="21"/>
-        </w:rPr>
-        <w:t>products</w:t>
+        <w:t>Native operating-system features beyond those used by the existing Expo mobile application</w:t>
       </w:r>
     </w:p>
     <w:p>
@@ -6040,191 +5629,7 @@
         </w:rPr>
       </w:pPr>
       <w:r>
-        <w:rPr>
-          <w:color w:val="212121"/>
-          <w:sz w:val="21"/>
-        </w:rPr>
-        <w:t>Third-party</w:t>
-      </w:r>
-      <w:r>
-        <w:rPr>
-          <w:color w:val="212121"/>
-          <w:spacing w:val="-5"/>
-          <w:sz w:val="21"/>
-        </w:rPr>
-        <w:t> </w:t>
-      </w:r>
-      <w:r>
-        <w:rPr>
-          <w:color w:val="212121"/>
-          <w:sz w:val="21"/>
-        </w:rPr>
-        <w:t>fleet</w:t>
-      </w:r>
-      <w:r>
-        <w:rPr>
-          <w:color w:val="212121"/>
-          <w:spacing w:val="-4"/>
-          <w:sz w:val="21"/>
-        </w:rPr>
-        <w:t> </w:t>
-      </w:r>
-      <w:r>
-        <w:rPr>
-          <w:color w:val="212121"/>
-          <w:sz w:val="21"/>
-        </w:rPr>
-        <w:t>management,</w:t>
-      </w:r>
-      <w:r>
-        <w:rPr>
-          <w:color w:val="212121"/>
-          <w:spacing w:val="-4"/>
-          <w:sz w:val="21"/>
-        </w:rPr>
-        <w:t> </w:t>
-      </w:r>
-      <w:r>
-        <w:rPr>
-          <w:color w:val="212121"/>
-          <w:sz w:val="21"/>
-        </w:rPr>
-        <w:t>energy</w:t>
-      </w:r>
-      <w:r>
-        <w:rPr>
-          <w:color w:val="212121"/>
-          <w:spacing w:val="-5"/>
-          <w:sz w:val="21"/>
-        </w:rPr>
-        <w:t> </w:t>
-      </w:r>
-      <w:r>
-        <w:rPr>
-          <w:color w:val="212121"/>
-          <w:sz w:val="21"/>
-        </w:rPr>
-        <w:t>trading,</w:t>
-      </w:r>
-      <w:r>
-        <w:rPr>
-          <w:color w:val="212121"/>
-          <w:spacing w:val="-5"/>
-          <w:sz w:val="21"/>
-        </w:rPr>
-        <w:t> </w:t>
-      </w:r>
-      <w:r>
-        <w:rPr>
-          <w:color w:val="212121"/>
-          <w:sz w:val="21"/>
-        </w:rPr>
-        <w:t>or</w:t>
-      </w:r>
-      <w:r>
-        <w:rPr>
-          <w:color w:val="212121"/>
-          <w:spacing w:val="-4"/>
-          <w:sz w:val="21"/>
-        </w:rPr>
-        <w:t> </w:t>
-      </w:r>
-      <w:r>
-        <w:rPr>
-          <w:color w:val="212121"/>
-          <w:sz w:val="21"/>
-        </w:rPr>
-        <w:t>grid-optimization</w:t>
-      </w:r>
-      <w:r>
-        <w:rPr>
-          <w:color w:val="212121"/>
-          <w:spacing w:val="-4"/>
-          <w:sz w:val="21"/>
-        </w:rPr>
-        <w:t> </w:t>
-      </w:r>
-      <w:r>
-        <w:rPr>
-          <w:color w:val="212121"/>
-          <w:sz w:val="21"/>
-        </w:rPr>
-        <w:t>capabilities</w:t>
-      </w:r>
-      <w:r>
-        <w:rPr>
-          <w:color w:val="212121"/>
-          <w:spacing w:val="-4"/>
-          <w:sz w:val="21"/>
-        </w:rPr>
-        <w:t> </w:t>
-      </w:r>
-      <w:r>
-        <w:rPr>
-          <w:color w:val="212121"/>
-          <w:sz w:val="21"/>
-        </w:rPr>
-        <w:t>not</w:t>
-      </w:r>
-      <w:r>
-        <w:rPr>
-          <w:color w:val="212121"/>
-          <w:spacing w:val="-4"/>
-          <w:sz w:val="21"/>
-        </w:rPr>
-        <w:t> </w:t>
-      </w:r>
-      <w:r>
-        <w:rPr>
-          <w:color w:val="212121"/>
-          <w:sz w:val="21"/>
-        </w:rPr>
-        <w:t>defined</w:t>
-      </w:r>
-      <w:r>
-        <w:rPr>
-          <w:color w:val="212121"/>
-          <w:spacing w:val="-5"/>
-          <w:sz w:val="21"/>
-        </w:rPr>
-        <w:t> </w:t>
-      </w:r>
-      <w:r>
-        <w:rPr>
-          <w:color w:val="212121"/>
-          <w:sz w:val="21"/>
-        </w:rPr>
-        <w:t>in</w:t>
-      </w:r>
-      <w:r>
-        <w:rPr>
-          <w:color w:val="212121"/>
-          <w:spacing w:val="-5"/>
-          <w:sz w:val="21"/>
-        </w:rPr>
-        <w:t> </w:t>
-      </w:r>
-      <w:r>
-        <w:rPr>
-          <w:color w:val="212121"/>
-          <w:sz w:val="21"/>
-        </w:rPr>
-        <w:t>the</w:t>
-      </w:r>
-      <w:r>
-        <w:rPr>
-          <w:color w:val="212121"/>
-          <w:spacing w:val="-5"/>
-          <w:sz w:val="21"/>
-        </w:rPr>
-        <w:t> </w:t>
-      </w:r>
-      <w:r>
-        <w:rPr>
-          <w:color w:val="212121"/>
-          <w:sz w:val="21"/>
-        </w:rPr>
-        <w:t>current solution scope</w:t>
+        <w:t>Energy trading, utility settlement, and physical grid dispatch or control</w:t>
       </w:r>
     </w:p>
     <w:p>
@@ -9064,117 +8469,7 @@
         </w:rPr>
       </w:pPr>
       <w:r>
-        <w:rPr>
-          <w:color w:val="212121"/>
-          <w:sz w:val="21"/>
-        </w:rPr>
-        <w:t>Relational</w:t>
-      </w:r>
-      <w:r>
-        <w:rPr>
-          <w:color w:val="212121"/>
-          <w:spacing w:val="-7"/>
-          <w:sz w:val="21"/>
-        </w:rPr>
-        <w:t> </w:t>
-      </w:r>
-      <w:r>
-        <w:rPr>
-          <w:color w:val="212121"/>
-          <w:sz w:val="21"/>
-        </w:rPr>
-        <w:t>database</w:t>
-      </w:r>
-      <w:r>
-        <w:rPr>
-          <w:color w:val="212121"/>
-          <w:spacing w:val="-7"/>
-          <w:sz w:val="21"/>
-        </w:rPr>
-        <w:t> </w:t>
-      </w:r>
-      <w:r>
-        <w:rPr>
-          <w:color w:val="212121"/>
-          <w:sz w:val="21"/>
-        </w:rPr>
-        <w:t>supporting</w:t>
-      </w:r>
-      <w:r>
-        <w:rPr>
-          <w:color w:val="212121"/>
-          <w:spacing w:val="-6"/>
-          <w:sz w:val="21"/>
-        </w:rPr>
-        <w:t> </w:t>
-      </w:r>
-      <w:r>
-        <w:rPr>
-          <w:color w:val="212121"/>
-          <w:sz w:val="21"/>
-        </w:rPr>
-        <w:t>transactional</w:t>
-      </w:r>
-      <w:r>
-        <w:rPr>
-          <w:color w:val="212121"/>
-          <w:spacing w:val="-6"/>
-          <w:sz w:val="21"/>
-        </w:rPr>
-        <w:t> </w:t>
-      </w:r>
-      <w:r>
-        <w:rPr>
-          <w:color w:val="212121"/>
-          <w:sz w:val="21"/>
-        </w:rPr>
-        <w:t>data</w:t>
-      </w:r>
-      <w:r>
-        <w:rPr>
-          <w:color w:val="212121"/>
-          <w:spacing w:val="-8"/>
-          <w:sz w:val="21"/>
-        </w:rPr>
-        <w:t> </w:t>
-      </w:r>
-      <w:r>
-        <w:rPr>
-          <w:color w:val="212121"/>
-          <w:sz w:val="21"/>
-        </w:rPr>
-        <w:t>and</w:t>
-      </w:r>
-      <w:r>
-        <w:rPr>
-          <w:color w:val="212121"/>
-          <w:spacing w:val="-6"/>
-          <w:sz w:val="21"/>
-        </w:rPr>
-        <w:t> </w:t>
-      </w:r>
-      <w:r>
-        <w:rPr>
-          <w:color w:val="212121"/>
-          <w:sz w:val="21"/>
-        </w:rPr>
-        <w:t>reporting</w:t>
-      </w:r>
-      <w:r>
-        <w:rPr>
-          <w:color w:val="212121"/>
-          <w:spacing w:val="-6"/>
-          <w:sz w:val="21"/>
-        </w:rPr>
-        <w:t> </w:t>
-      </w:r>
-      <w:r>
-        <w:rPr>
-          <w:color w:val="212121"/>
-          <w:spacing w:val="-2"/>
-          <w:sz w:val="21"/>
-        </w:rPr>
-        <w:t>records.</w:t>
+        <w:t>MongoDB document database supporting operational data and reporting records.</w:t>
       </w:r>
     </w:p>
     <w:p>
@@ -33057,101 +32352,7 @@
               </w:rPr>
             </w:pPr>
             <w:r>
-              <w:rPr>
-                <w:color w:val="212121"/>
-                <w:sz w:val="21"/>
-              </w:rPr>
-              <w:t>Core business rules, especially reservation conflict logic,</w:t>
-            </w:r>
-            <w:r>
-              <w:rPr>
-                <w:color w:val="212121"/>
-                <w:spacing w:val="-8"/>
-                <w:sz w:val="21"/>
-              </w:rPr>
-              <w:t> </w:t>
-            </w:r>
-            <w:r>
-              <w:rPr>
-                <w:color w:val="212121"/>
-                <w:sz w:val="21"/>
-              </w:rPr>
-              <w:t>shall</w:t>
-            </w:r>
-            <w:r>
-              <w:rPr>
-                <w:color w:val="212121"/>
-                <w:spacing w:val="-7"/>
-                <w:sz w:val="21"/>
-              </w:rPr>
-              <w:t> </w:t>
-            </w:r>
-            <w:r>
-              <w:rPr>
-                <w:color w:val="212121"/>
-                <w:sz w:val="21"/>
-              </w:rPr>
-              <w:t>be</w:t>
-            </w:r>
-            <w:r>
-              <w:rPr>
-                <w:color w:val="212121"/>
-                <w:spacing w:val="-8"/>
-                <w:sz w:val="21"/>
-              </w:rPr>
-              <w:t> </w:t>
-            </w:r>
-            <w:r>
-              <w:rPr>
-                <w:color w:val="212121"/>
-                <w:sz w:val="21"/>
-              </w:rPr>
-              <w:t>verifiable</w:t>
-            </w:r>
-            <w:r>
-              <w:rPr>
-                <w:color w:val="212121"/>
-                <w:spacing w:val="-8"/>
-                <w:sz w:val="21"/>
-              </w:rPr>
-              <w:t> </w:t>
-            </w:r>
-            <w:r>
-              <w:rPr>
-                <w:color w:val="212121"/>
-                <w:sz w:val="21"/>
-              </w:rPr>
-              <w:t>through</w:t>
-            </w:r>
-            <w:r>
-              <w:rPr>
-                <w:color w:val="212121"/>
-                <w:spacing w:val="-7"/>
-                <w:sz w:val="21"/>
-              </w:rPr>
-              <w:t> </w:t>
-            </w:r>
-            <w:r>
-              <w:rPr>
-                <w:color w:val="212121"/>
-                <w:sz w:val="21"/>
-              </w:rPr>
-              <w:t>automated</w:t>
-            </w:r>
-            <w:r>
-              <w:rPr>
-                <w:color w:val="212121"/>
-                <w:spacing w:val="-7"/>
-                <w:sz w:val="21"/>
-              </w:rPr>
-              <w:t> </w:t>
-            </w:r>
-            <w:r>
-              <w:rPr>
-                <w:color w:val="212121"/>
-                <w:sz w:val="21"/>
-              </w:rPr>
-              <w:t>testing.</w:t>
+              <w:t>Core booking, authorization, renewable forecast, and optimization rules shall be verifiable through automated testing.</w:t>
             </w:r>
           </w:p>
         </w:tc>
@@ -35817,207 +35018,7 @@
         </w:rPr>
       </w:pPr>
       <w:r>
-        <w:rPr>
-          <w:color w:val="212121"/>
-          <w:sz w:val="21"/>
-        </w:rPr>
-        <w:t>The</w:t>
-      </w:r>
-      <w:r>
-        <w:rPr>
-          <w:color w:val="212121"/>
-          <w:spacing w:val="-4"/>
-          <w:sz w:val="21"/>
-        </w:rPr>
-        <w:t> </w:t>
-      </w:r>
-      <w:r>
-        <w:rPr>
-          <w:color w:val="212121"/>
-          <w:sz w:val="21"/>
-        </w:rPr>
-        <w:t>baseline</w:t>
-      </w:r>
-      <w:r>
-        <w:rPr>
-          <w:color w:val="212121"/>
-          <w:spacing w:val="-4"/>
-          <w:sz w:val="21"/>
-        </w:rPr>
-        <w:t> </w:t>
-      </w:r>
-      <w:r>
-        <w:rPr>
-          <w:color w:val="212121"/>
-          <w:sz w:val="21"/>
-        </w:rPr>
-        <w:t>release</w:t>
-      </w:r>
-      <w:r>
-        <w:rPr>
-          <w:color w:val="212121"/>
-          <w:spacing w:val="-4"/>
-          <w:sz w:val="21"/>
-        </w:rPr>
-        <w:t> </w:t>
-      </w:r>
-      <w:r>
-        <w:rPr>
-          <w:color w:val="212121"/>
-          <w:sz w:val="21"/>
-        </w:rPr>
-        <w:t>is</w:t>
-      </w:r>
-      <w:r>
-        <w:rPr>
-          <w:color w:val="212121"/>
-          <w:spacing w:val="-4"/>
-          <w:sz w:val="21"/>
-        </w:rPr>
-        <w:t> </w:t>
-      </w:r>
-      <w:r>
-        <w:rPr>
-          <w:color w:val="212121"/>
-          <w:sz w:val="21"/>
-        </w:rPr>
-        <w:t>a</w:t>
-      </w:r>
-      <w:r>
-        <w:rPr>
-          <w:color w:val="212121"/>
-          <w:spacing w:val="-3"/>
-          <w:sz w:val="21"/>
-        </w:rPr>
-        <w:t> </w:t>
-      </w:r>
-      <w:r>
-        <w:rPr>
-          <w:color w:val="212121"/>
-          <w:sz w:val="21"/>
-        </w:rPr>
-        <w:t>web</w:t>
-      </w:r>
-      <w:r>
-        <w:rPr>
-          <w:color w:val="212121"/>
-          <w:spacing w:val="-3"/>
-          <w:sz w:val="21"/>
-        </w:rPr>
-        <w:t> </w:t>
-      </w:r>
-      <w:r>
-        <w:rPr>
-          <w:color w:val="212121"/>
-          <w:sz w:val="21"/>
-        </w:rPr>
-        <w:t>application</w:t>
-      </w:r>
-      <w:r>
-        <w:rPr>
-          <w:color w:val="212121"/>
-          <w:spacing w:val="-3"/>
-          <w:sz w:val="21"/>
-        </w:rPr>
-        <w:t> </w:t>
-      </w:r>
-      <w:r>
-        <w:rPr>
-          <w:color w:val="212121"/>
-          <w:sz w:val="21"/>
-        </w:rPr>
-        <w:t>rather</w:t>
-      </w:r>
-      <w:r>
-        <w:rPr>
-          <w:color w:val="212121"/>
-          <w:spacing w:val="-3"/>
-          <w:sz w:val="21"/>
-        </w:rPr>
-        <w:t> </w:t>
-      </w:r>
-      <w:r>
-        <w:rPr>
-          <w:color w:val="212121"/>
-          <w:sz w:val="21"/>
-        </w:rPr>
-        <w:t>than</w:t>
-      </w:r>
-      <w:r>
-        <w:rPr>
-          <w:color w:val="212121"/>
-          <w:spacing w:val="-3"/>
-          <w:sz w:val="21"/>
-        </w:rPr>
-        <w:t> </w:t>
-      </w:r>
-      <w:r>
-        <w:rPr>
-          <w:color w:val="212121"/>
-          <w:sz w:val="21"/>
-        </w:rPr>
-        <w:t>a</w:t>
-      </w:r>
-      <w:r>
-        <w:rPr>
-          <w:color w:val="212121"/>
-          <w:spacing w:val="-4"/>
-          <w:sz w:val="21"/>
-        </w:rPr>
-        <w:t> </w:t>
-      </w:r>
-      <w:r>
-        <w:rPr>
-          <w:color w:val="212121"/>
-          <w:sz w:val="21"/>
-        </w:rPr>
-        <w:t>separate</w:t>
-      </w:r>
-      <w:r>
-        <w:rPr>
-          <w:color w:val="212121"/>
-          <w:spacing w:val="-3"/>
-          <w:sz w:val="21"/>
-        </w:rPr>
-        <w:t> </w:t>
-      </w:r>
-      <w:r>
-        <w:rPr>
-          <w:color w:val="212121"/>
-          <w:sz w:val="21"/>
-        </w:rPr>
-        <w:t>native</w:t>
-      </w:r>
-      <w:r>
-        <w:rPr>
-          <w:color w:val="212121"/>
-          <w:spacing w:val="-4"/>
-          <w:sz w:val="21"/>
-        </w:rPr>
-        <w:t> </w:t>
-      </w:r>
-      <w:r>
-        <w:rPr>
-          <w:color w:val="212121"/>
-          <w:sz w:val="21"/>
-        </w:rPr>
-        <w:t>mobile</w:t>
-      </w:r>
-      <w:r>
-        <w:rPr>
-          <w:color w:val="212121"/>
-          <w:spacing w:val="-4"/>
-          <w:sz w:val="21"/>
-        </w:rPr>
-        <w:t> </w:t>
-      </w:r>
-      <w:r>
-        <w:rPr>
-          <w:color w:val="212121"/>
-          <w:spacing w:val="-2"/>
-          <w:sz w:val="21"/>
-        </w:rPr>
-        <w:t>product.</w:t>
+        <w:t>The release includes a React web application and an Expo/React Native mobile application.</w:t>
       </w:r>
     </w:p>
     <w:p>
@@ -36394,132 +35395,7 @@
         </w:rPr>
       </w:pPr>
       <w:r>
-        <w:rPr>
-          <w:color w:val="212121"/>
-          <w:sz w:val="21"/>
-        </w:rPr>
-        <w:t>A</w:t>
-      </w:r>
-      <w:r>
-        <w:rPr>
-          <w:color w:val="212121"/>
-          <w:spacing w:val="-6"/>
-          <w:sz w:val="21"/>
-        </w:rPr>
-        <w:t> </w:t>
-      </w:r>
-      <w:r>
-        <w:rPr>
-          <w:color w:val="212121"/>
-          <w:sz w:val="21"/>
-        </w:rPr>
-        <w:t>relational</w:t>
-      </w:r>
-      <w:r>
-        <w:rPr>
-          <w:color w:val="212121"/>
-          <w:spacing w:val="-6"/>
-          <w:sz w:val="21"/>
-        </w:rPr>
-        <w:t> </w:t>
-      </w:r>
-      <w:r>
-        <w:rPr>
-          <w:color w:val="212121"/>
-          <w:sz w:val="21"/>
-        </w:rPr>
-        <w:t>database</w:t>
-      </w:r>
-      <w:r>
-        <w:rPr>
-          <w:color w:val="212121"/>
-          <w:spacing w:val="-6"/>
-          <w:sz w:val="21"/>
-        </w:rPr>
-        <w:t> </w:t>
-      </w:r>
-      <w:r>
-        <w:rPr>
-          <w:color w:val="212121"/>
-          <w:sz w:val="21"/>
-        </w:rPr>
-        <w:t>supporting</w:t>
-      </w:r>
-      <w:r>
-        <w:rPr>
-          <w:color w:val="212121"/>
-          <w:spacing w:val="-6"/>
-          <w:sz w:val="21"/>
-        </w:rPr>
-        <w:t> </w:t>
-      </w:r>
-      <w:r>
-        <w:rPr>
-          <w:color w:val="212121"/>
-          <w:sz w:val="21"/>
-        </w:rPr>
-        <w:t>transactional</w:t>
-      </w:r>
-      <w:r>
-        <w:rPr>
-          <w:color w:val="212121"/>
-          <w:spacing w:val="-6"/>
-          <w:sz w:val="21"/>
-        </w:rPr>
-        <w:t> </w:t>
-      </w:r>
-      <w:r>
-        <w:rPr>
-          <w:color w:val="212121"/>
-          <w:sz w:val="21"/>
-        </w:rPr>
-        <w:t>storage</w:t>
-      </w:r>
-      <w:r>
-        <w:rPr>
-          <w:color w:val="212121"/>
-          <w:spacing w:val="-5"/>
-          <w:sz w:val="21"/>
-        </w:rPr>
-        <w:t> </w:t>
-      </w:r>
-      <w:r>
-        <w:rPr>
-          <w:color w:val="212121"/>
-          <w:sz w:val="21"/>
-        </w:rPr>
-        <w:t>and</w:t>
-      </w:r>
-      <w:r>
-        <w:rPr>
-          <w:color w:val="212121"/>
-          <w:spacing w:val="-5"/>
-          <w:sz w:val="21"/>
-        </w:rPr>
-        <w:t> </w:t>
-      </w:r>
-      <w:r>
-        <w:rPr>
-          <w:color w:val="212121"/>
-          <w:sz w:val="21"/>
-        </w:rPr>
-        <w:t>integrity</w:t>
-      </w:r>
-      <w:r>
-        <w:rPr>
-          <w:color w:val="212121"/>
-          <w:spacing w:val="-6"/>
-          <w:sz w:val="21"/>
-        </w:rPr>
-        <w:t> </w:t>
-      </w:r>
-      <w:r>
-        <w:rPr>
-          <w:color w:val="212121"/>
-          <w:spacing w:val="-2"/>
-          <w:sz w:val="21"/>
-        </w:rPr>
-        <w:t>constraints.</w:t>
+        <w:t>A MongoDB database with application-enforced integrity rules and indexed document collections.</w:t>
       </w:r>
     </w:p>
     <w:p>
@@ -46710,11 +45586,797 @@
         </w:drawing>
       </w:r>
     </w:p>
+    <w:p>
+      <w:pPr>
+        <w:sectPr>
+          <w:headerReference w:type="default" r:id="rId9"/>
+          <w:footerReference w:type="default" r:id="rId10"/>
+          <w:pgSz w:w="16840" w:h="11910" w:orient="landscape"/>
+          <w:pgMar w:header="452" w:footer="390" w:top="1400" w:bottom="580" w:left="708" w:right="708"/>
+        </w:sectPr>
+      </w:pPr>
+    </w:p>
+    <w:p>
+      <w:pPr>
+        <w:pStyle w:val="RenewableHeading1"/>
+      </w:pPr>
+      <w:r>
+        <w:t>Renewable Energy Intelligence Addendum</w:t>
+      </w:r>
+    </w:p>
+    <w:p>
+      <w:r>
+        <w:rPr>
+          <w:b/>
+        </w:rPr>
+        <w:t xml:space="preserve">HackOut'26 alignment. </w:t>
+      </w:r>
+      <w:r>
+        <w:t>This addendum extends the existing booking, station, session, billing, security, and operator capabilities. It does not replace those proven flows.</w:t>
+      </w:r>
+    </w:p>
+    <w:p>
+      <w:pPr>
+        <w:pStyle w:val="RenewableHeading2"/>
+      </w:pPr>
+      <w:r>
+        <w:t>Problem and Intended Outcome</w:t>
+      </w:r>
+    </w:p>
+    <w:p>
+      <w:pPr>
+        <w:pStyle w:val="BodyText"/>
+      </w:pPr>
+      <w:r>
+        <w:rPr>
+          <w:b/>
+        </w:rPr>
+        <w:t xml:space="preserve">Drivers. </w:t>
+      </w:r>
+      <w:r>
+        <w:t>Need understandable choices that show when charging is greener, cheaper, or faster.</w:t>
+      </w:r>
+    </w:p>
+    <w:p>
+      <w:pPr>
+        <w:pStyle w:val="BodyText"/>
+      </w:pPr>
+      <w:r>
+        <w:rPr>
+          <w:b/>
+        </w:rPr>
+        <w:t xml:space="preserve">Station operators. </w:t>
+      </w:r>
+      <w:r>
+        <w:t>Need capacity-aware forecasts so flexible demand can move away from peak periods.</w:t>
+      </w:r>
+    </w:p>
+    <w:p>
+      <w:pPr>
+        <w:pStyle w:val="BodyText"/>
+      </w:pPr>
+      <w:r>
+        <w:rPr>
+          <w:b/>
+        </w:rPr>
+        <w:t xml:space="preserve">Grid operators. </w:t>
+      </w:r>
+      <w:r>
+        <w:t>Need a regional view of forecast renewable supply, EV demand, and potential overload windows.</w:t>
+      </w:r>
+    </w:p>
+    <w:p>
+      <w:pPr>
+        <w:pStyle w:val="BodyText"/>
+      </w:pPr>
+      <w:r>
+        <w:rPr>
+          <w:b/>
+        </w:rPr>
+        <w:t xml:space="preserve">Outcome. </w:t>
+      </w:r>
+      <w:r>
+        <w:t>Increase renewable charging share, reduce peak stress and avoidable cost, and show estimated carbon impact transparently.</w:t>
+      </w:r>
+    </w:p>
+    <w:p>
+      <w:pPr>
+        <w:pStyle w:val="RenewableHeading2"/>
+      </w:pPr>
+      <w:r>
+        <w:t>Implemented Renewable-Aware Flow</w:t>
+      </w:r>
+    </w:p>
+    <w:p>
+      <w:pPr>
+        <w:pStyle w:val="BodyText"/>
+      </w:pPr>
+      <w:r>
+        <w:rPr>
+          <w:b/>
+        </w:rPr>
+        <w:t xml:space="preserve">Step 1. </w:t>
+      </w:r>
+      <w:r>
+        <w:t>The platform obtains a normalized regional energy outlook from a configured provider. If live data is unavailable or not configured, it uses a deterministic and visibly labeled DEMO/SIMULATED model.</w:t>
+      </w:r>
+    </w:p>
+    <w:p>
+      <w:pPr>
+        <w:pStyle w:val="BodyText"/>
+      </w:pPr>
+      <w:r>
+        <w:rPr>
+          <w:b/>
+        </w:rPr>
+        <w:t xml:space="preserve">Step 2. </w:t>
+      </w:r>
+      <w:r>
+        <w:t>The driver supplies station, energy requirement, charging power, flexible start/end window, and a preference: GREENEST, CHEAPEST, FASTEST, or BALANCED.</w:t>
+      </w:r>
+    </w:p>
+    <w:p>
+      <w:pPr>
+        <w:pStyle w:val="BodyText"/>
+      </w:pPr>
+      <w:r>
+        <w:rPr>
+          <w:b/>
+        </w:rPr>
+        <w:t xml:space="preserve">Step 3. </w:t>
+      </w:r>
+      <w:r>
+        <w:t>The backend divides the window into 30-minute candidates, limits power to charger and available-station capacity, and estimates renewable share, grid load, tariff, and carbon for each candidate.</w:t>
+      </w:r>
+    </w:p>
+    <w:p>
+      <w:pPr>
+        <w:pStyle w:val="BodyText"/>
+      </w:pPr>
+      <w:r>
+        <w:rPr>
+          <w:b/>
+        </w:rPr>
+        <w:t xml:space="preserve">Step 4. </w:t>
+      </w:r>
+      <w:r>
+        <w:t>The backend returns four explainable alternatives. The requested preference appears first, and every option includes timing, expected cost, carbon, carbon saved against immediate charging, and a 0-100 green score.</w:t>
+      </w:r>
+    </w:p>
+    <w:p>
+      <w:pPr>
+        <w:pStyle w:val="BodyText"/>
+      </w:pPr>
+      <w:r>
+        <w:rPr>
+          <w:b/>
+        </w:rPr>
+        <w:t xml:space="preserve">Step 5. </w:t>
+      </w:r>
+      <w:r>
+        <w:t>Station and grid personas review the 24-hour renewable and EV-demand forecasts, current capacity, renewable-surplus timing, and peak-risk timing.</w:t>
+      </w:r>
+    </w:p>
+    <w:p>
+      <w:pPr>
+        <w:pStyle w:val="RenewableHeading2"/>
+        <w:pageBreakBefore/>
+      </w:pPr>
+      <w:r>
+        <w:t>Functional Requirements Extension</w:t>
+      </w:r>
+    </w:p>
+    <w:tbl>
+      <w:tblPr>
+        <w:tblW w:type="auto" w:w="0"/>
+        <w:tblLayout w:type="fixed"/>
+        <w:tblLook w:firstColumn="1" w:firstRow="1" w:lastColumn="0" w:lastRow="0" w:noHBand="0" w:noVBand="1" w:val="04A0"/>
+        <w:tblBorders>
+          <w:top w:val="single" w:sz="4" w:color="B7D7C7"/>
+          <w:left w:val="single" w:sz="4" w:color="B7D7C7"/>
+          <w:bottom w:val="single" w:sz="4" w:color="B7D7C7"/>
+          <w:right w:val="single" w:sz="4" w:color="B7D7C7"/>
+          <w:insideH w:val="single" w:sz="4" w:color="B7D7C7"/>
+          <w:insideV w:val="single" w:sz="4" w:color="B7D7C7"/>
+        </w:tblBorders>
+      </w:tblPr>
+      <w:tblGrid>
+        <w:gridCol w:w="3213"/>
+        <w:gridCol w:w="3213"/>
+        <w:gridCol w:w="3213"/>
+      </w:tblGrid>
+      <w:tr>
+        <w:tc>
+          <w:tcPr>
+            <w:tcW w:type="dxa" w:w="1134"/>
+          </w:tcPr>
+          <w:p>
+            <w:r>
+              <w:t>ID</w:t>
+            </w:r>
+          </w:p>
+        </w:tc>
+        <w:tc>
+          <w:tcPr>
+            <w:tcW w:type="dxa" w:w="7087"/>
+          </w:tcPr>
+          <w:p>
+            <w:r>
+              <w:t>Requirement</w:t>
+            </w:r>
+          </w:p>
+        </w:tc>
+        <w:tc>
+          <w:tcPr>
+            <w:tcW w:type="dxa" w:w="1417"/>
+          </w:tcPr>
+          <w:p>
+            <w:r>
+              <w:t>Priority</w:t>
+            </w:r>
+          </w:p>
+        </w:tc>
+      </w:tr>
+      <w:tr>
+        <w:tc>
+          <w:tcPr>
+            <w:tcW w:type="dxa" w:w="1134"/>
+          </w:tcPr>
+          <w:p>
+            <w:r>
+              <w:t>REN-01</w:t>
+            </w:r>
+          </w:p>
+        </w:tc>
+        <w:tc>
+          <w:tcPr>
+            <w:tcW w:type="dxa" w:w="7087"/>
+          </w:tcPr>
+          <w:p>
+            <w:r>
+              <w:t>The system shall expose current and forecast regional renewable-energy conditions with source, mode, and quality labels.</w:t>
+            </w:r>
+          </w:p>
+        </w:tc>
+        <w:tc>
+          <w:tcPr>
+            <w:tcW w:type="dxa" w:w="1417"/>
+          </w:tcPr>
+          <w:p>
+            <w:r>
+              <w:t>Must</w:t>
+            </w:r>
+          </w:p>
+        </w:tc>
+      </w:tr>
+      <w:tr>
+        <w:tc>
+          <w:tcPr>
+            <w:tcW w:type="dxa" w:w="1134"/>
+          </w:tcPr>
+          <w:p>
+            <w:r>
+              <w:t>REN-02</w:t>
+            </w:r>
+          </w:p>
+        </w:tc>
+        <w:tc>
+          <w:tcPr>
+            <w:tcW w:type="dxa" w:w="7087"/>
+          </w:tcPr>
+          <w:p>
+            <w:r>
+              <w:t>The system shall provide a deterministic offline demo provider whose solar, wind, demand, price, and carbon patterns remain repeatable.</w:t>
+            </w:r>
+          </w:p>
+        </w:tc>
+        <w:tc>
+          <w:tcPr>
+            <w:tcW w:type="dxa" w:w="1417"/>
+          </w:tcPr>
+          <w:p>
+            <w:r>
+              <w:t>Must</w:t>
+            </w:r>
+          </w:p>
+        </w:tc>
+      </w:tr>
+      <w:tr>
+        <w:tc>
+          <w:tcPr>
+            <w:tcW w:type="dxa" w:w="1134"/>
+          </w:tcPr>
+          <w:p>
+            <w:r>
+              <w:t>REN-03</w:t>
+            </w:r>
+          </w:p>
+        </w:tc>
+        <w:tc>
+          <w:tcPr>
+            <w:tcW w:type="dxa" w:w="7087"/>
+          </w:tcPr>
+          <w:p>
+            <w:r>
+              <w:t>The system shall cache provider results and fall back safely when the configured external adapter fails or returns invalid data.</w:t>
+            </w:r>
+          </w:p>
+        </w:tc>
+        <w:tc>
+          <w:tcPr>
+            <w:tcW w:type="dxa" w:w="1417"/>
+          </w:tcPr>
+          <w:p>
+            <w:r>
+              <w:t>Must</w:t>
+            </w:r>
+          </w:p>
+        </w:tc>
+      </w:tr>
+      <w:tr>
+        <w:tc>
+          <w:tcPr>
+            <w:tcW w:type="dxa" w:w="1134"/>
+          </w:tcPr>
+          <w:p>
+            <w:r>
+              <w:t>REN-04</w:t>
+            </w:r>
+          </w:p>
+        </w:tc>
+        <w:tc>
+          <w:tcPr>
+            <w:tcW w:type="dxa" w:w="7087"/>
+          </w:tcPr>
+          <w:p>
+            <w:r>
+              <w:t>Authenticated customers shall be able to request capacity-aware charging alternatives for a flexible time window.</w:t>
+            </w:r>
+          </w:p>
+        </w:tc>
+        <w:tc>
+          <w:tcPr>
+            <w:tcW w:type="dxa" w:w="1417"/>
+          </w:tcPr>
+          <w:p>
+            <w:r>
+              <w:t>Must</w:t>
+            </w:r>
+          </w:p>
+        </w:tc>
+      </w:tr>
+      <w:tr>
+        <w:tc>
+          <w:tcPr>
+            <w:tcW w:type="dxa" w:w="1134"/>
+          </w:tcPr>
+          <w:p>
+            <w:r>
+              <w:t>REN-05</w:t>
+            </w:r>
+          </w:p>
+        </w:tc>
+        <w:tc>
+          <w:tcPr>
+            <w:tcW w:type="dxa" w:w="7087"/>
+          </w:tcPr>
+          <w:p>
+            <w:r>
+              <w:t>The optimizer shall reject invalid, expired, longer-than-48-hour, or energy-infeasible requests.</w:t>
+            </w:r>
+          </w:p>
+        </w:tc>
+        <w:tc>
+          <w:tcPr>
+            <w:tcW w:type="dxa" w:w="1417"/>
+          </w:tcPr>
+          <w:p>
+            <w:r>
+              <w:t>Must</w:t>
+            </w:r>
+          </w:p>
+        </w:tc>
+      </w:tr>
+      <w:tr>
+        <w:tc>
+          <w:tcPr>
+            <w:tcW w:type="dxa" w:w="1134"/>
+          </w:tcPr>
+          <w:p>
+            <w:r>
+              <w:t>REN-06</w:t>
+            </w:r>
+          </w:p>
+        </w:tc>
+        <w:tc>
+          <w:tcPr>
+            <w:tcW w:type="dxa" w:w="7087"/>
+          </w:tcPr>
+          <w:p>
+            <w:r>
+              <w:t>Station operators and administrators shall be able to view current load, capacity, renewable surplus, peak risk, and 24-hour forecasts.</w:t>
+            </w:r>
+          </w:p>
+        </w:tc>
+        <w:tc>
+          <w:tcPr>
+            <w:tcW w:type="dxa" w:w="1417"/>
+          </w:tcPr>
+          <w:p>
+            <w:r>
+              <w:t>Must</w:t>
+            </w:r>
+          </w:p>
+        </w:tc>
+      </w:tr>
+      <w:tr>
+        <w:tc>
+          <w:tcPr>
+            <w:tcW w:type="dxa" w:w="1134"/>
+          </w:tcPr>
+          <w:p>
+            <w:r>
+              <w:t>REN-07</w:t>
+            </w:r>
+          </w:p>
+        </w:tc>
+        <w:tc>
+          <w:tcPr>
+            <w:tcW w:type="dxa" w:w="7087"/>
+          </w:tcPr>
+          <w:p>
+            <w:r>
+              <w:t>Administrators may represent the grid-operator persona in the hackathon build; a new production role is not introduced without a complete authorization migration.</w:t>
+            </w:r>
+          </w:p>
+        </w:tc>
+        <w:tc>
+          <w:tcPr>
+            <w:tcW w:type="dxa" w:w="1417"/>
+          </w:tcPr>
+          <w:p>
+            <w:r>
+              <w:t>Must</w:t>
+            </w:r>
+          </w:p>
+        </w:tc>
+      </w:tr>
+      <w:tr>
+        <w:tc>
+          <w:tcPr>
+            <w:tcW w:type="dxa" w:w="1134"/>
+          </w:tcPr>
+          <w:p>
+            <w:r>
+              <w:t>REN-08</w:t>
+            </w:r>
+          </w:p>
+        </w:tc>
+        <w:tc>
+          <w:tcPr>
+            <w:tcW w:type="dxa" w:w="7087"/>
+          </w:tcPr>
+          <w:p>
+            <w:r>
+              <w:t>Web and mobile interfaces shall communicate status with text as well as color and shall visibly identify simulated data.</w:t>
+            </w:r>
+          </w:p>
+        </w:tc>
+        <w:tc>
+          <w:tcPr>
+            <w:tcW w:type="dxa" w:w="1417"/>
+          </w:tcPr>
+          <w:p>
+            <w:r>
+              <w:t>Must</w:t>
+            </w:r>
+          </w:p>
+        </w:tc>
+      </w:tr>
+    </w:tbl>
+    <w:p>
+      <w:pPr>
+        <w:pStyle w:val="RenewableHeading2"/>
+        <w:spacing w:after="40"/>
+      </w:pPr>
+      <w:r>
+        <w:rPr>
+          <w:sz w:val="19"/>
+        </w:rPr>
+        <w:t>Data, APIs, and Security</w:t>
+      </w:r>
+    </w:p>
+    <w:p>
+      <w:pPr>
+        <w:pStyle w:val="BodyText"/>
+        <w:spacing w:after="40"/>
+      </w:pPr>
+      <w:r>
+        <w:rPr>
+          <w:b/>
+          <w:sz w:val="19"/>
+        </w:rPr>
+        <w:t xml:space="preserve">Storage. </w:t>
+      </w:r>
+      <w:r>
+        <w:rPr>
+          <w:sz w:val="19"/>
+        </w:rPr>
+        <w:t>The operational datastore is MongoDB. Renewable forecast values in the MVP are calculated DTOs and cache entries rather than authoritative utility records.</w:t>
+      </w:r>
+    </w:p>
+    <w:p>
+      <w:pPr>
+        <w:pStyle w:val="BodyText"/>
+        <w:spacing w:after="40"/>
+      </w:pPr>
+      <w:r>
+        <w:rPr>
+          <w:b/>
+          <w:sz w:val="19"/>
+        </w:rPr>
+        <w:t xml:space="preserve">Public APIs. </w:t>
+      </w:r>
+      <w:r>
+        <w:rPr>
+          <w:sz w:val="19"/>
+        </w:rPr>
+        <w:t>GET /api/energy/current and GET /api/energy/forecast.</w:t>
+      </w:r>
+    </w:p>
+    <w:p>
+      <w:pPr>
+        <w:pStyle w:val="BodyText"/>
+        <w:spacing w:after="40"/>
+      </w:pPr>
+      <w:r>
+        <w:rPr>
+          <w:b/>
+          <w:sz w:val="19"/>
+        </w:rPr>
+        <w:t xml:space="preserve">Customer API. </w:t>
+      </w:r>
+      <w:r>
+        <w:rPr>
+          <w:sz w:val="19"/>
+        </w:rPr>
+        <w:t>POST /api/optimization/charging-options.</w:t>
+      </w:r>
+    </w:p>
+    <w:p>
+      <w:pPr>
+        <w:pStyle w:val="BodyText"/>
+        <w:spacing w:after="40"/>
+      </w:pPr>
+      <w:r>
+        <w:rPr>
+          <w:b/>
+          <w:sz w:val="19"/>
+        </w:rPr>
+        <w:t xml:space="preserve">Operator APIs. </w:t>
+      </w:r>
+      <w:r>
+        <w:rPr>
+          <w:sz w:val="19"/>
+        </w:rPr>
+        <w:t>GET /api/operator/energy/dashboard and GET /api/grid/dashboard (ADMIN only).</w:t>
+      </w:r>
+    </w:p>
+    <w:p>
+      <w:pPr>
+        <w:pStyle w:val="BodyText"/>
+        <w:spacing w:after="40"/>
+      </w:pPr>
+      <w:r>
+        <w:rPr>
+          <w:b/>
+          <w:sz w:val="19"/>
+        </w:rPr>
+        <w:t xml:space="preserve">Secrets. </w:t>
+      </w:r>
+      <w:r>
+        <w:rPr>
+          <w:sz w:val="19"/>
+        </w:rPr>
+        <w:t>External-provider credentials are read only from environment variables and never stored in source control, clients, or MongoDB.</w:t>
+      </w:r>
+    </w:p>
+    <w:p>
+      <w:pPr>
+        <w:pStyle w:val="BodyText"/>
+        <w:spacing w:after="40"/>
+      </w:pPr>
+      <w:r>
+        <w:rPr>
+          <w:b/>
+          <w:sz w:val="19"/>
+        </w:rPr>
+        <w:t xml:space="preserve">Authorization. </w:t>
+      </w:r>
+      <w:r>
+        <w:rPr>
+          <w:sz w:val="19"/>
+        </w:rPr>
+        <w:t>Customer, station-operator, and administrator route boundaries remain enforced by Spring Security and regression tests.</w:t>
+      </w:r>
+    </w:p>
+    <w:p>
+      <w:pPr>
+        <w:pStyle w:val="RenewableHeading2"/>
+        <w:spacing w:after="40"/>
+      </w:pPr>
+      <w:r>
+        <w:rPr>
+          <w:sz w:val="19"/>
+        </w:rPr>
+        <w:t>Forecast and Optimization Method</w:t>
+      </w:r>
+    </w:p>
+    <w:p>
+      <w:pPr>
+        <w:spacing w:after="40"/>
+      </w:pPr>
+      <w:r>
+        <w:rPr>
+          <w:sz w:val="19"/>
+        </w:rPr>
+        <w:t>The hackathon forecast is an explainable deterministic model, not machine learning. It models daylight solar production, gradual wind variation, morning and evening demand peaks, inverse carbon intensity, and demand-sensitive price. EV demand uses time-of-day and weekday factors with a documented DEMO fallback. The optimizer combines normalized renewable, price, peak-load, carbon, and waiting-time signals while enforcing energy-delivery and power-capacity constraints.</w:t>
+      </w:r>
+    </w:p>
+    <w:p>
+      <w:pPr>
+        <w:pStyle w:val="RenewableHeading2"/>
+        <w:spacing w:after="40"/>
+      </w:pPr>
+      <w:r>
+        <w:rPr>
+          <w:sz w:val="19"/>
+        </w:rPr>
+        <w:t>Acceptance Criteria</w:t>
+      </w:r>
+    </w:p>
+    <w:p>
+      <w:pPr>
+        <w:pStyle w:val="BodyText"/>
+        <w:spacing w:after="40"/>
+      </w:pPr>
+      <w:r>
+        <w:rPr>
+          <w:b/>
+          <w:sz w:val="19"/>
+        </w:rPr>
+        <w:t xml:space="preserve">AC-01. </w:t>
+      </w:r>
+      <w:r>
+        <w:rPr>
+          <w:sz w:val="19"/>
+        </w:rPr>
+        <w:t>The demonstration works without internet access or external API credentials.</w:t>
+      </w:r>
+    </w:p>
+    <w:p>
+      <w:pPr>
+        <w:pStyle w:val="BodyText"/>
+        <w:spacing w:after="40"/>
+      </w:pPr>
+      <w:r>
+        <w:rPr>
+          <w:b/>
+          <w:sz w:val="19"/>
+        </w:rPr>
+        <w:t xml:space="preserve">AC-02. </w:t>
+      </w:r>
+      <w:r>
+        <w:rPr>
+          <w:sz w:val="19"/>
+        </w:rPr>
+        <w:t>Every simulated value is labeled DEMO or SIMULATED and no screen claims utility-grade real-time measurement.</w:t>
+      </w:r>
+    </w:p>
+    <w:p>
+      <w:pPr>
+        <w:pStyle w:val="BodyText"/>
+        <w:spacing w:after="40"/>
+      </w:pPr>
+      <w:r>
+        <w:rPr>
+          <w:b/>
+          <w:sz w:val="19"/>
+        </w:rPr>
+        <w:t xml:space="preserve">AC-03. </w:t>
+      </w:r>
+      <w:r>
+        <w:rPr>
+          <w:sz w:val="19"/>
+        </w:rPr>
+        <w:t>The same forecast inputs produce repeatable values, and the same charging request produces the same recommended schedules within the same forecast window.</w:t>
+      </w:r>
+    </w:p>
+    <w:p>
+      <w:pPr>
+        <w:pStyle w:val="BodyText"/>
+        <w:spacing w:after="40"/>
+      </w:pPr>
+      <w:r>
+        <w:rPr>
+          <w:b/>
+          <w:sz w:val="19"/>
+        </w:rPr>
+        <w:t xml:space="preserve">AC-04. </w:t>
+      </w:r>
+      <w:r>
+        <w:rPr>
+          <w:sz w:val="19"/>
+        </w:rPr>
+        <w:t>A customer can compare all four scheduling strategies on web and mobile.</w:t>
+      </w:r>
+    </w:p>
+    <w:p>
+      <w:pPr>
+        <w:pStyle w:val="BodyText"/>
+        <w:spacing w:after="40"/>
+      </w:pPr>
+      <w:r>
+        <w:rPr>
+          <w:b/>
+          <w:sz w:val="19"/>
+        </w:rPr>
+        <w:t xml:space="preserve">AC-05. </w:t>
+      </w:r>
+      <w:r>
+        <w:rPr>
+          <w:sz w:val="19"/>
+        </w:rPr>
+        <w:t>An operator can identify the next renewable-surplus and peak-risk windows and see station capacity guidance.</w:t>
+      </w:r>
+    </w:p>
+    <w:p>
+      <w:pPr>
+        <w:pStyle w:val="BodyText"/>
+        <w:spacing w:after="40"/>
+      </w:pPr>
+      <w:r>
+        <w:rPr>
+          <w:b/>
+          <w:sz w:val="19"/>
+        </w:rPr>
+        <w:t xml:space="preserve">AC-06. </w:t>
+      </w:r>
+      <w:r>
+        <w:rPr>
+          <w:sz w:val="19"/>
+        </w:rPr>
+        <w:t>Backend compile, optimization tests, authorization tests, frontend build/security checks, and mobile security checks pass in the supported toolchain.</w:t>
+      </w:r>
+    </w:p>
+    <w:p>
+      <w:pPr>
+        <w:pStyle w:val="RenewableHeading2"/>
+        <w:spacing w:after="40"/>
+      </w:pPr>
+      <w:r>
+        <w:rPr>
+          <w:sz w:val="19"/>
+        </w:rPr>
+        <w:t>Known Hackathon Limitations</w:t>
+      </w:r>
+    </w:p>
+    <w:p>
+      <w:pPr>
+        <w:spacing w:after="40"/>
+      </w:pPr>
+      <w:r>
+        <w:rPr>
+          <w:sz w:val="19"/>
+        </w:rPr>
+        <w:t>Forecasts are planning estimates. Production requires a licensed grid-data source. The MVP does not perform dispatch, settlement, OCPP control, certified carbon accounting, booking rescheduling, or billing adjustments.</w:t>
+      </w:r>
+    </w:p>
     <w:sectPr>
-      <w:headerReference w:type="default" r:id="rId9"/>
-      <w:footerReference w:type="default" r:id="rId10"/>
-      <w:pgSz w:w="16840" w:h="11910" w:orient="landscape"/>
-      <w:pgMar w:header="452" w:footer="390" w:top="1400" w:bottom="580" w:left="708" w:right="708"/>
+      <w:headerReference w:type="default" r:id="rId13"/>
+      <w:footerReference w:type="default" r:id="rId14"/>
+      <w:pgSz w:w="11906" w:h="16838"/>
+      <w:pgMar w:header="452" w:footer="390" w:top="1134" w:bottom="1134" w:left="1134" w:right="1134"/>
     </w:sectPr>
   </w:body>
 </w:document>
@@ -47886,6 +47548,23 @@
 </w:ftr>
 </file>
 
+<file path=word/footer4.xml><?xml version="1.0" encoding="utf-8"?>
+<w:ftr xmlns:m="http://schemas.openxmlformats.org/officeDocument/2006/math" xmlns:mc="http://schemas.openxmlformats.org/markup-compatibility/2006" xmlns:mo="http://schemas.microsoft.com/office/mac/office/2008/main" xmlns:mv="urn:schemas-microsoft-com:mac:vml" xmlns:o="urn:schemas-microsoft-com:office:office" xmlns:r="http://schemas.openxmlformats.org/officeDocument/2006/relationships" xmlns:v="urn:schemas-microsoft-com:vml" xmlns:w10="urn:schemas-microsoft-com:office:word" xmlns:w14="http://schemas.microsoft.com/office/word/2010/wordml" xmlns:w="http://schemas.openxmlformats.org/wordprocessingml/2006/main" xmlns:wne="http://schemas.microsoft.com/office/word/2006/wordml" xmlns:wp14="http://schemas.microsoft.com/office/word/2010/wordprocessingDrawing" xmlns:wp="http://schemas.openxmlformats.org/drawingml/2006/wordprocessingDrawing" xmlns:wpc="http://schemas.microsoft.com/office/word/2010/wordprocessingCanvas" xmlns:wpg="http://schemas.microsoft.com/office/word/2010/wordprocessingGroup" xmlns:wpi="http://schemas.microsoft.com/office/word/2010/wordprocessingInk" xmlns:wps="http://schemas.microsoft.com/office/word/2010/wordprocessingShape" mc:Ignorable="w14 wp14">
+  <w:p>
+    <w:pPr>
+      <w:pStyle w:val="Footer"/>
+      <w:jc w:val="center"/>
+    </w:pPr>
+    <w:r>
+      <w:rPr>
+        <w:sz w:val="16"/>
+      </w:rPr>
+      <w:t>PLUGIN SRS v1.1 | HackOut'26</w:t>
+    </w:r>
+  </w:p>
+</w:ftr>
+</file>
+
 <file path=word/header1.xml><?xml version="1.0" encoding="utf-8"?>
 <w:hdr xmlns:mc="http://schemas.openxmlformats.org/markup-compatibility/2006" xmlns:ve="http://schemas.openxmlformats.org/markup-compatibility/2006" xmlns:o="urn:schemas-microsoft-com:office:office" xmlns:r="http://schemas.openxmlformats.org/officeDocument/2006/relationships" xmlns:m="http://schemas.openxmlformats.org/officeDocument/2006/math" xmlns:v="urn:schemas-microsoft-com:vml" xmlns:wp="http://schemas.openxmlformats.org/drawingml/2006/wordprocessingDrawing" xmlns:w10="urn:schemas-microsoft-com:office:word" xmlns:w="http://schemas.openxmlformats.org/wordprocessingml/2006/main" xmlns:wne="http://schemas.microsoft.com/office/word/2006/wordml" xmlns:a="http://schemas.openxmlformats.org/drawingml/2006/main" xmlns:pic="http://schemas.openxmlformats.org/drawingml/2006/picture" xmlns:wpg="http://schemas.microsoft.com/office/word/2010/wordprocessingGroup" xmlns:wps="http://schemas.microsoft.com/office/word/2010/wordprocessingShape" xmlns:w14="http://schemas.microsoft.com/office/word/2010/wordml" mc:Ignorable="w14" xml:space="preserve">
   <w:p>
@@ -48662,6 +48341,23 @@
 </w:hdr>
 </file>
 
+<file path=word/header4.xml><?xml version="1.0" encoding="utf-8"?>
+<w:hdr xmlns:m="http://schemas.openxmlformats.org/officeDocument/2006/math" xmlns:mc="http://schemas.openxmlformats.org/markup-compatibility/2006" xmlns:mo="http://schemas.microsoft.com/office/mac/office/2008/main" xmlns:mv="urn:schemas-microsoft-com:mac:vml" xmlns:o="urn:schemas-microsoft-com:office:office" xmlns:r="http://schemas.openxmlformats.org/officeDocument/2006/relationships" xmlns:v="urn:schemas-microsoft-com:vml" xmlns:w10="urn:schemas-microsoft-com:office:word" xmlns:w14="http://schemas.microsoft.com/office/word/2010/wordml" xmlns:w="http://schemas.openxmlformats.org/wordprocessingml/2006/main" xmlns:wne="http://schemas.microsoft.com/office/word/2006/wordml" xmlns:wp14="http://schemas.microsoft.com/office/word/2010/wordprocessingDrawing" xmlns:wp="http://schemas.openxmlformats.org/drawingml/2006/wordprocessingDrawing" xmlns:wpc="http://schemas.microsoft.com/office/word/2010/wordprocessingCanvas" xmlns:wpg="http://schemas.microsoft.com/office/word/2010/wordprocessingGroup" xmlns:wpi="http://schemas.microsoft.com/office/word/2010/wordprocessingInk" xmlns:wps="http://schemas.microsoft.com/office/word/2010/wordprocessingShape" mc:Ignorable="w14 wp14">
+  <w:p>
+    <w:pPr>
+      <w:pStyle w:val="Header"/>
+      <w:jc w:val="right"/>
+    </w:pPr>
+    <w:r>
+      <w:rPr>
+        <w:sz w:val="16"/>
+      </w:rPr>
+      <w:t>PLUGIN - Renewable Energy Intelligence Addendum</w:t>
+    </w:r>
+  </w:p>
+</w:hdr>
+</file>
+
 <file path=word/numbering.xml><?xml version="1.0" encoding="utf-8"?>
 <w:numbering xmlns:ve="http://schemas.openxmlformats.org/markup-compatibility/2006" xmlns:o="urn:schemas-microsoft-com:office:office" xmlns:r="http://schemas.openxmlformats.org/officeDocument/2006/relationships" xmlns:m="http://schemas.openxmlformats.org/officeDocument/2006/math" xmlns:v="urn:schemas-microsoft-com:vml" xmlns:wp="http://schemas.openxmlformats.org/drawingml/2006/wordprocessingDrawing" xmlns:w10="urn:schemas-microsoft-com:office:word" xmlns:w="http://schemas.openxmlformats.org/wordprocessingml/2006/main" xmlns:wne="http://schemas.microsoft.com/office/word/2006/wordml">
   <w:abstractNum w:abstractNumId="1">
@@ -49008,6 +48704,7 @@
     <w:pPr/>
     <w:rPr>
       <w:rFonts w:ascii="Calibri" w:hAnsi="Calibri" w:eastAsia="Calibri" w:cs="Calibri"/>
+      <w:sz w:val="21"/>
       <w:lang w:val="en-US" w:eastAsia="en-US" w:bidi="ar-SA"/>
     </w:rPr>
   </w:style>
@@ -49065,6 +48762,30 @@
     <w:rPr>
       <w:rFonts w:ascii="Calibri" w:hAnsi="Calibri" w:eastAsia="Calibri" w:cs="Calibri"/>
       <w:lang w:val="en-US" w:eastAsia="en-US" w:bidi="ar-SA"/>
+    </w:rPr>
+  </w:style>
+  <w:style w:type="paragraph" w:customStyle="1" w:styleId="RenewableHeading1">
+    <w:name w:val="Renewable Heading 1"/>
+    <w:pPr>
+      <w:spacing w:before="240" w:after="160"/>
+    </w:pPr>
+    <w:rPr>
+      <w:rFonts w:ascii="Aptos Display" w:hAnsi="Aptos Display"/>
+      <w:b/>
+      <w:color w:val="10704B"/>
+      <w:sz w:val="40"/>
+    </w:rPr>
+  </w:style>
+  <w:style w:type="paragraph" w:customStyle="1" w:styleId="RenewableHeading2">
+    <w:name w:val="Renewable Heading 2"/>
+    <w:pPr>
+      <w:spacing w:before="200" w:after="100"/>
+    </w:pPr>
+    <w:rPr>
+      <w:rFonts w:ascii="Aptos Display" w:hAnsi="Aptos Display"/>
+      <w:b/>
+      <w:color w:val="18503B"/>
+      <w:sz w:val="28"/>
     </w:rPr>
   </w:style>
 </w:styles>

</xml_diff>